<commit_message>
Started making optimizations. FIrst step, Quad trees. Has values, needed logic
</commit_message>
<xml_diff>
--- a/classwork_Non_assments/Lets_open_Doors/User Interface Programming - Project Research Workbook.docx
+++ b/classwork_Non_assments/Lets_open_Doors/User Interface Programming - Project Research Workbook.docx
@@ -601,7 +601,7 @@
           <w:p/>
           <w:p>
             <w:r>
-              <w:object w:dxaOrig="1596" w:dyaOrig="1033" w14:anchorId="64CAF19A">
+              <w:object w:dxaOrig="1539" w:dyaOrig="997" w14:anchorId="64CAF19A">
                 <v:shapetype id="_x0000_t75" coordsize="21600,21600" o:spt="75" o:preferrelative="t" path="m@4@5l@4@11@9@11@9@5xe" filled="f" stroked="f">
                   <v:stroke joinstyle="miter"/>
                   <v:formulas>
@@ -621,10 +621,10 @@
                   <v:path o:extrusionok="f" gradientshapeok="t" o:connecttype="rect"/>
                   <o:lock v:ext="edit" aspectratio="t"/>
                 </v:shapetype>
-                <v:shape id="_x0000_i1025" type="#_x0000_t75" style="width:80.25pt;height:51pt" o:ole="">
+                <v:shape id="_x0000_i1027" type="#_x0000_t75" style="width:77.25pt;height:49.5pt" o:ole="">
                   <v:imagedata r:id="rId13" o:title=""/>
                 </v:shape>
-                <o:OLEObject Type="Embed" ProgID="Package" ShapeID="_x0000_i1025" DrawAspect="Icon" ObjectID="_1843883100" r:id="rId14"/>
+                <o:OLEObject Type="Embed" ProgID="Package" ShapeID="_x0000_i1027" DrawAspect="Icon" ObjectID="_1843887456" r:id="rId14"/>
               </w:object>
             </w:r>
             <w:r>
@@ -639,19 +639,58 @@
             <w:r>
               <w:t xml:space="preserve">During the game play, </w:t>
             </w:r>
+            <w:r>
+              <w:t>there</w:t>
+            </w:r>
+            <w:r>
+              <w:t xml:space="preserve"> will be a display on the top left </w:t>
+            </w:r>
+            <w:r>
+              <w:t>corner that</w:t>
+            </w:r>
+            <w:r>
+              <w:t xml:space="preserve"> will have </w:t>
+            </w:r>
             <w:proofErr w:type="gramStart"/>
             <w:r>
-              <w:t>There</w:t>
+              <w:t>an</w:t>
             </w:r>
             <w:proofErr w:type="gramEnd"/>
             <w:r>
-              <w:t xml:space="preserve"> will be a display on the top left </w:t>
-            </w:r>
-            <w:r>
-              <w:t>corner that</w:t>
-            </w:r>
-            <w:r>
-              <w:t xml:space="preserve"> will have </w:t>
+              <w:t xml:space="preserve"> simple box showing info of the current objective.  What is the objective, how many parts are completed, and how may parts be there to complete. </w:t>
+            </w:r>
+            <w:r>
+              <w:br/>
+            </w:r>
+            <w:r>
+              <w:br/>
+            </w:r>
+            <w:r>
+              <w:t xml:space="preserve">When the level loads, it will </w:t>
+            </w:r>
+            <w:r>
+              <w:t>search for the end goal and link the displayed values stored within and load the completed objectives as valued zero.</w:t>
+            </w:r>
+          </w:p>
+          <w:p>
+            <w:r>
+              <w:br/>
+              <w:t>For every objective, once complete, will grab the values of completed objectives and increase it by one, causing the display of completed parts to increase as well. For example, each door they open will make the display be one more then precisely displayed.</w:t>
+            </w:r>
+            <w:r>
+              <w:t xml:space="preserve"> Next to it would a button that </w:t>
+            </w:r>
+            <w:r>
+              <w:t>opens the pause menu</w:t>
+            </w:r>
+            <w:r>
+              <w:t xml:space="preserve"> for mobile users.</w:t>
+            </w:r>
+          </w:p>
+          <w:p/>
+          <w:p>
+            <w:r>
+              <w:t xml:space="preserve">For better read ability, there will be </w:t>
             </w:r>
             <w:proofErr w:type="gramStart"/>
             <w:r>
@@ -659,31 +698,16 @@
             </w:r>
             <w:proofErr w:type="gramEnd"/>
             <w:r>
-              <w:t xml:space="preserve"> simple box showing info of the current objective.  What is the objective, how many parts are completed, and how may parts be there to complete. </w:t>
-            </w:r>
-            <w:r>
-              <w:br/>
-            </w:r>
-            <w:r>
-              <w:br/>
-            </w:r>
-            <w:r>
-              <w:t xml:space="preserve">When the level loads, it will </w:t>
-            </w:r>
-            <w:r>
-              <w:t>search for the end goal and link the displayed values stored within and load the completed objectives as valued zero.</w:t>
-            </w:r>
-          </w:p>
-          <w:p>
-            <w:r>
-              <w:br/>
-              <w:t>For every objective, once complete, will grab the values of completed objectives and increase it by one, causing the display of completed parts to increase as well. For example, each door they open will make the display be one more then precisely displayed.</w:t>
-            </w:r>
-          </w:p>
-          <w:p/>
-          <w:p>
-            <w:r>
-              <w:t xml:space="preserve">For better read ability, there will be </w:t>
+              <w:t xml:space="preserve"> box behind the information to better separate the info from the gameplay view yet coloured to not draw to much attention.</w:t>
+            </w:r>
+            <w:r>
+              <w:t xml:space="preserve"> </w:t>
+            </w:r>
+          </w:p>
+          <w:p/>
+          <w:p>
+            <w:r>
+              <w:t xml:space="preserve">The bottom corners of the screen will be used for touch controls for </w:t>
             </w:r>
             <w:proofErr w:type="gramStart"/>
             <w:r>
@@ -691,32 +715,31 @@
             </w:r>
             <w:proofErr w:type="gramEnd"/>
             <w:r>
-              <w:t xml:space="preserve"> box behind the information to better separate the info from the gameplay view yet coloured to not draw to much attention.</w:t>
-            </w:r>
-          </w:p>
-          <w:p/>
-          <w:p>
-            <w:r>
-              <w:t xml:space="preserve">The bottom corners of the screen will be used for touch controls for </w:t>
+              <w:t xml:space="preserve"> mobile user. </w:t>
+            </w:r>
+            <w:r>
+              <w:t xml:space="preserve">Both left for </w:t>
+            </w:r>
+            <w:r>
+              <w:t>movement,</w:t>
+            </w:r>
+            <w:r>
+              <w:t xml:space="preserve"> bottom right for alter the camera’s view. </w:t>
+            </w:r>
+            <w:r>
+              <w:br/>
+            </w:r>
+            <w:r>
+              <w:br/>
+              <w:t xml:space="preserve">On the right side there is a time display showing how long it takes for you to complete the level. It updates every second </w:t>
             </w:r>
             <w:proofErr w:type="gramStart"/>
             <w:r>
-              <w:t>an</w:t>
+              <w:t>As</w:t>
             </w:r>
             <w:proofErr w:type="gramEnd"/>
             <w:r>
-              <w:t xml:space="preserve"> mobile user. </w:t>
-            </w:r>
-            <w:r>
-              <w:t xml:space="preserve">Both left for </w:t>
-            </w:r>
-            <w:proofErr w:type="gramStart"/>
-            <w:r>
-              <w:t>movement ,</w:t>
-            </w:r>
-            <w:proofErr w:type="gramEnd"/>
-            <w:r>
-              <w:t xml:space="preserve"> bottom right for alter the camera’s view. </w:t>
+              <w:t xml:space="preserve"> soon as the level starts.</w:t>
             </w:r>
           </w:p>
           <w:p/>
@@ -783,7 +806,6 @@
           </w:p>
           <w:p>
             <w:r>
-              <w:lastRenderedPageBreak/>
               <w:t xml:space="preserve">Word documents </w:t>
             </w:r>
           </w:p>

</xml_diff>